<commit_message>
Update index page and resume documents
</commit_message>
<xml_diff>
--- a/assets/docs/Yuvaraj_Ravindra_CV.docx
+++ b/assets/docs/Yuvaraj_Ravindra_CV.docx
@@ -78,6 +78,15 @@
       </w:r>
       <w:r>
         <w:t>/in/yuvaraj-ravindra-ab941747</w:t>
+      </w:r>
+      <w:r>
+        <w:t>•</w:t>
+      </w:r>
+      <w:r>
+        <w:t xml:space="preserve"> </w:t>
+      </w:r>
+      <w:r>
+        <w:t>https://yuva271010.github.io</w:t>
       </w:r>
     </w:p>
     <w:p>
@@ -159,21 +168,11 @@
       <w:r>
         <w:t xml:space="preserve">Lakehouse/Warehouse, </w:t>
       </w:r>
-      <w:proofErr w:type="spellStart"/>
       <w:r>
         <w:t>OneLake</w:t>
       </w:r>
-      <w:proofErr w:type="spellEnd"/>
       <w:r>
-        <w:t xml:space="preserve"> concepts, Dataflows Gen2, Pipelines (orchestration), Notebooks (</w:t>
-      </w:r>
-      <w:proofErr w:type="spellStart"/>
-      <w:r>
-        <w:t>PySpark</w:t>
-      </w:r>
-      <w:proofErr w:type="spellEnd"/>
-      <w:r>
-        <w:t>), medallion architecture</w:t>
+        <w:t xml:space="preserve"> concepts, Dataflows Gen2, Pipelines (orchestration), Notebooks (PySpark), medallion architecture</w:t>
       </w:r>
     </w:p>
     <w:p>
@@ -341,13 +340,8 @@
       <w:r>
         <w:t xml:space="preserve">Architected an end-to-end analytics ecosystem (data marts, governance workflows, semantic layers) serving 400+ users across 10 </w:t>
       </w:r>
-      <w:proofErr w:type="gramStart"/>
       <w:r>
-        <w:t>departments;</w:t>
-      </w:r>
-      <w:proofErr w:type="gramEnd"/>
-      <w:r>
-        <w:t xml:space="preserve"> </w:t>
+        <w:t xml:space="preserve">departments; </w:t>
       </w:r>
       <w:r>
         <w:t>improved KPI consistency and decision quality across commercial teams.</w:t>
@@ -358,15 +352,7 @@
         <w:pStyle w:val="ListBullet"/>
       </w:pPr>
       <w:r>
-        <w:t xml:space="preserve">Defined enterprise data modernization </w:t>
-      </w:r>
-      <w:proofErr w:type="gramStart"/>
-      <w:r>
-        <w:t>roadmap;</w:t>
-      </w:r>
-      <w:proofErr w:type="gramEnd"/>
-      <w:r>
-        <w:t xml:space="preserve"> led platform proofs-of-concept for Snowflake and Microsoft Fabric and produced target-state architecture, migration sequencing, and operating </w:t>
+        <w:t xml:space="preserve">Defined enterprise data modernization roadmap; led platform proofs-of-concept for Snowflake and Microsoft Fabric and produced target-state architecture, migration sequencing, and operating </w:t>
       </w:r>
       <w:r>
         <w:t>models</w:t>
@@ -482,15 +468,7 @@
         <w:pStyle w:val="ListBullet"/>
       </w:pPr>
       <w:r>
-        <w:t xml:space="preserve">Architected CRM and delivered seamless ERP integration using MuleSoft and Scribe as the integration </w:t>
-      </w:r>
-      <w:proofErr w:type="gramStart"/>
-      <w:r>
-        <w:t>bus;</w:t>
-      </w:r>
-      <w:proofErr w:type="gramEnd"/>
-      <w:r>
-        <w:t xml:space="preserve"> improved process consistency across customer, pricing, and order </w:t>
+        <w:t xml:space="preserve">Architected CRM and delivered seamless ERP integration using MuleSoft and Scribe as the integration bus; improved process consistency across customer, pricing, and order </w:t>
       </w:r>
       <w:r>
         <w:t>domains</w:t>
@@ -554,15 +532,7 @@
         <w:pStyle w:val="ListBullet"/>
       </w:pPr>
       <w:r>
-        <w:t xml:space="preserve">EMEA </w:t>
-      </w:r>
-      <w:proofErr w:type="gramStart"/>
-      <w:r>
-        <w:t>lead for</w:t>
-      </w:r>
-      <w:proofErr w:type="gramEnd"/>
-      <w:r>
-        <w:t xml:space="preserve"> CRM/ERP and BI support (Sales, </w:t>
+        <w:t xml:space="preserve">EMEA lead for CRM/ERP and BI support (Sales, </w:t>
       </w:r>
       <w:r>
         <w:t xml:space="preserve">Supply Chain, </w:t>
@@ -799,15 +769,7 @@
         <w:t>ing Languages:</w:t>
       </w:r>
       <w:r>
-        <w:t xml:space="preserve"> SQL, DAX, Power Query (M), Python/</w:t>
-      </w:r>
-      <w:proofErr w:type="spellStart"/>
-      <w:r>
-        <w:t>PySpark</w:t>
-      </w:r>
-      <w:proofErr w:type="spellEnd"/>
-      <w:r>
-        <w:t>, SSIS, PL/SQL, C++, Java, Unix/Linux Scripting</w:t>
+        <w:t xml:space="preserve"> SQL, DAX, Power Query (M), Python/PySpark, SSIS, PL/SQL, C++, Java, Unix/Linux Scripting</w:t>
       </w:r>
     </w:p>
     <w:p>
@@ -4426,6 +4388,7 @@
   <w:style w:type="character" w:default="1" w:styleId="DefaultParagraphFont">
     <w:name w:val="Default Paragraph Font"/>
     <w:uiPriority w:val="1"/>
+    <w:semiHidden/>
     <w:unhideWhenUsed/>
   </w:style>
   <w:style w:type="table" w:default="1" w:styleId="TableNormal">

</xml_diff>